<commit_message>
Clarify resume lines that were vague, fragmented, or incomplete
Rewrite the Vistra process-engine and environmental-platform bullets so the
work and the $60 million result actually follow, and turn Samsung, Compaq,
Stanford, and a few other fragments into complete sentences.

Co-authored-by: tymarler <tymarler@users.noreply.github.com>
</commit_message>
<xml_diff>
--- a/resume/indeed/Anthony_Ty_Marler_Indeed_Resume.docx
+++ b/resume/indeed/Anthony_Ty_Marler_Indeed_Resume.docx
@@ -83,7 +83,7 @@
           <w:color w:val="222222"/>
           <w:sz w:val="20"/>
         </w:rPr>
-        <w:t>Senior application architect and fractional CTO currently shipping AI-assisted products with Cursor, Claude, and ChatGPT. Previously spent five years at Vistra designing generation, mining, and emissions systems, including a cloud credit-trading platform that accounted for $60 million in profit in the first two months. Named inventor on two U.S. patents. Combines AWS, .NET, SQL, and systems integration with energy, mining, and manufacturing domain expertise, and leads cross-functional teams through the full project lifecycle.</w:t>
+        <w:t>Senior application architect and fractional CTO currently shipping AI-assisted products with Cursor, Claude, and ChatGPT. Previously spent five years at Vistra designing generation, mining, and emissions systems, including an environmental data platform for credit trading that accounted for $60 million in profit in the first two months. Named inventor on two U.S. patents. Combines AWS, .NET, SQL, and systems integration with energy, mining, and manufacturing domain expertise, and leads cross-functional teams through the full project lifecycle.</w:t>
       </w:r>
     </w:p>
     <w:p>
@@ -196,7 +196,7 @@
           <w:color w:val="222222"/>
           <w:sz w:val="20"/>
         </w:rPr>
-        <w:t>Used Cursor, Claude, and ChatGPT to architect and develop an international fugitive-tracking application and a custom architectural-planning website.</w:t>
+        <w:t>Used Cursor, Claude, and ChatGPT to architect and develop an international fugitive-tracking application and a custom architectural planning website.</w:t>
       </w:r>
     </w:p>
     <w:p>
@@ -213,7 +213,7 @@
           <w:color w:val="222222"/>
           <w:sz w:val="20"/>
         </w:rPr>
-        <w:t>Delivered a clothing-brand retail / e-commerce site and an internet television streaming application with AI-assisted architecture, UI, and backend development.</w:t>
+        <w:t>Delivered a clothing-brand retail site and an internet television streaming application with AI-assisted architecture, UI, and backend development.</w:t>
       </w:r>
     </w:p>
     <w:p>
@@ -275,7 +275,7 @@
           <w:color w:val="222222"/>
           <w:sz w:val="20"/>
         </w:rPr>
-        <w:t>Designed and developed a data-driven process engine to manage dynamic tasks, providing automated steps to drive the process to completion.</w:t>
+        <w:t>Designed and developed a data-driven process engine that automated dynamic operational tasks and drove each workflow to completion.</w:t>
       </w:r>
     </w:p>
     <w:p>
@@ -292,7 +292,7 @@
           <w:color w:val="222222"/>
           <w:sz w:val="20"/>
         </w:rPr>
-        <w:t>Designed and developed mine planning and monitoring software to calculate productivity and measure results by shift.</w:t>
+        <w:t>Designed and developed mine planning and monitoring software that measured productivity by shift.</w:t>
       </w:r>
     </w:p>
     <w:p>
@@ -309,7 +309,7 @@
           <w:color w:val="222222"/>
           <w:sz w:val="20"/>
         </w:rPr>
-        <w:t>Designed and developed a cloud-based AWS platform that ingested SCADA, PLC, and third-party emissions data into a normalized database for credit trading; accounted for $60 million in profit in the first two months, cut trading latency from weeks to hours, and reduced compliance reporting time by 80%.</w:t>
+        <w:t>Designed and developed an AWS platform that ingested SCADA, PLC, and third-party environmental feeds and normalized actual and planned environmental data with planned generation so traders could act on a single picture of fleet position; the platform accounted for $60 million in profit in the first two months, cut trading latency from weeks to hours, and reduced compliance reporting time by 80%.</w:t>
       </w:r>
     </w:p>
     <w:p>
@@ -326,7 +326,7 @@
           <w:color w:val="222222"/>
           <w:sz w:val="20"/>
         </w:rPr>
-        <w:t>Led web applications supporting mining, fossil generation, battery, and solar operations, including Tableau dashboards for traders and compliance officers.</w:t>
+        <w:t>Led development of web applications supporting mining, fossil generation, battery, and solar operations, including Tableau dashboards for traders and compliance officers.</w:t>
       </w:r>
     </w:p>
     <w:p>
@@ -518,7 +518,7 @@
           <w:color w:val="222222"/>
           <w:sz w:val="20"/>
         </w:rPr>
-        <w:t>Provided architectural solutions for new builds and rebuilds to improve reliability and functionality, including TCO analysis of existing and future-state environments.</w:t>
+        <w:t>Provided architecture for new builds and rebuilds to improve reliability and function, including TCO analysis of current and future-state environments.</w:t>
       </w:r>
     </w:p>
     <w:p>
@@ -676,7 +676,7 @@
           <w:color w:val="222222"/>
           <w:sz w:val="20"/>
         </w:rPr>
-        <w:t>Worldwide software systems architecture for PC manufacturing and configuration platforms.</w:t>
+        <w:t>Architected worldwide software systems for PC manufacturing and configuration platforms.</w:t>
       </w:r>
     </w:p>
     <w:p>
@@ -738,7 +738,7 @@
           <w:color w:val="222222"/>
           <w:sz w:val="20"/>
         </w:rPr>
-        <w:t>Invented and developed a patented software-delivery system that eliminated more than 70% of the manufacture time of Compaq computers. Also invented a post-sales configuration method that increased inventory flexibility.</w:t>
+        <w:t>Invented and developed a patented software-delivery system that cut more than 70% of the time required to manufacture Compaq computers. Also invented a post-sales configuration method that increased inventory flexibility.</w:t>
       </w:r>
     </w:p>
     <w:p>
@@ -817,7 +817,7 @@
           <w:color w:val="222222"/>
           <w:sz w:val="20"/>
         </w:rPr>
-        <w:t>Designed and implemented a hardware-based voice-recognition system for hands-free data collection in harsh environments (early applied AI / speech recognition).</w:t>
+        <w:t>Designed and implemented a hardware-based voice-recognition system for hands-free data collection in harsh environments.</w:t>
       </w:r>
     </w:p>
     <w:p>
@@ -879,7 +879,7 @@
           <w:color w:val="222222"/>
           <w:sz w:val="20"/>
         </w:rPr>
-        <w:t>Worked on a team to develop planning and control software for the defense communication satellite network.</w:t>
+        <w:t>Developed planning and control software for the defense communications satellite network as part of a project team.</w:t>
       </w:r>
     </w:p>
     <w:p>

</xml_diff>